<commit_message>
Align manuscript supplements and spatial maximum-score bandwidth analysis
Sync final supplementary files, preserve worksheet content while removing local-path metadata, document the 10-candidate S19 display and full 30-candidate validation, and retain needle-event fields as diagnostics only. Add selector tests and numerical regression checks; preserve the observed 0.04-SW result.
</commit_message>
<xml_diff>
--- a/supplementary-material/Supplementary Table S1.docx
+++ b/supplementary-material/Supplementary Table S1.docx
@@ -50,11 +50,11 @@
         <w:tblLook w:val="04A0" w:firstRow="1" w:lastRow="0" w:firstColumn="1" w:lastColumn="0" w:noHBand="0" w:noVBand="1"/>
       </w:tblPr>
       <w:tblGrid>
-        <w:gridCol w:w="3149"/>
-        <w:gridCol w:w="3873"/>
-        <w:gridCol w:w="2373"/>
-        <w:gridCol w:w="3756"/>
-        <w:gridCol w:w="1065"/>
+        <w:gridCol w:w="3084"/>
+        <w:gridCol w:w="3792"/>
+        <w:gridCol w:w="2324"/>
+        <w:gridCol w:w="3972"/>
+        <w:gridCol w:w="1044"/>
       </w:tblGrid>
       <w:tr>
         <w:trPr>
@@ -572,7 +572,7 @@
               <w:rPr>
                 <w:rFonts w:ascii="Times New Roman" w:eastAsia="仿宋" w:hAnsi="Times New Roman" w:cs="Times New Roman"/>
               </w:rPr>
-              <w:t>Angle velocity-change mean</w:t>
+              <w:t>Mean absolute angular velocity</w:t>
             </w:r>
           </w:p>
           <w:p>
@@ -592,7 +592,7 @@
               <w:rPr>
                 <w:rFonts w:ascii="Times New Roman" w:eastAsia="仿宋" w:hAnsi="Times New Roman" w:cs="Times New Roman"/>
               </w:rPr>
-              <w:t>Angle velocity-change SD</w:t>
+              <w:t>Angular-velocity SD</w:t>
             </w:r>
           </w:p>
         </w:tc>

</xml_diff>